<commit_message>
Release 0.4.0, and read the version from the assembly
Bumps both projects to 0.4.0 for the work added since 0.3.0: query sync
against a central server, client-side AES+HMAC encryption of the query
library, and the query library manager.

The version was written out by hand in three places and had already
drifted — the About box still said 0.2.0 while the projects said 0.3.0.
Both runtime strings now read AssemblyInformationalVersion from the
running assembly and trim the git suffix the SDK appends, so there is a
single source of truth: <Version> in the csproj.

Verified rather than assumed: the published executable is stamped
0.4.0+<commit>, and the running server reports "version":"0.4.0" from
/api/v1/health.

Docs and deck updated to match. 146 checks passing.

Co-Authored-By: Claude Opus 4.8 <noreply@anthropic.com>
</commit_message>
<xml_diff>
--- a/docs/Qplus Technical Documentation.docx
+++ b/docs/Qplus Technical Documentation.docx
@@ -62,7 +62,7 @@
           <w:sz w:val="22"/>
           <w:szCs w:val="22"/>
         </w:rPr>
-        <w:t xml:space="preserve">Version 0.3.0</w:t>
+        <w:t xml:space="preserve">Version 0.4.0</w:t>
       </w:r>
     </w:p>
     <w:p>
@@ -6583,7 +6583,7 @@
         <w:sz w:val="18"/>
         <w:szCs w:val="18"/>
       </w:rPr>
-      <w:t xml:space="preserve">Qplus 0.3.0  —  page </w:t>
+      <w:t xml:space="preserve">Qplus 0.4.0  —  page </w:t>
     </w:r>
     <w:r>
       <w:rPr>

</xml_diff>